<commit_message>
Primer commit - Estructura base ClinicaMedica
</commit_message>
<xml_diff>
--- a/ClinicaMedica/Practica Programacion Basica.docx
+++ b/ClinicaMedica/Practica Programacion Basica.docx
@@ -43,17 +43,6 @@
           <w:lang w:val="es-MX"/>
         </w:rPr>
       </w:pPr>
-    </w:p>
-    <w:p>
-      <w:pPr>
-        <w:jc w:val="both"/>
-        <w:rPr>
-          <w:rFonts w:ascii="Amasis MT Pro Black" w:hAnsi="Amasis MT Pro Black" w:cs="Aharoni"/>
-          <w:sz w:val="48"/>
-          <w:szCs w:val="48"/>
-          <w:lang w:val="es-MX"/>
-        </w:rPr>
-      </w:pPr>
       <w:r>
         <w:rPr>
           <w:rFonts w:ascii="Amasis MT Pro Black" w:hAnsi="Amasis MT Pro Black" w:cs="Aharoni"/>
@@ -85,17 +74,6 @@
           <w:lang w:val="es-MX"/>
         </w:rPr>
       </w:pPr>
-    </w:p>
-    <w:p>
-      <w:pPr>
-        <w:jc w:val="both"/>
-        <w:rPr>
-          <w:rFonts w:ascii="Amasis MT Pro Black" w:hAnsi="Amasis MT Pro Black" w:cs="Aharoni"/>
-          <w:sz w:val="48"/>
-          <w:szCs w:val="48"/>
-          <w:lang w:val="es-MX"/>
-        </w:rPr>
-      </w:pPr>
       <w:r>
         <w:rPr>
           <w:rFonts w:ascii="Amasis MT Pro Black" w:hAnsi="Amasis MT Pro Black" w:cs="Aharoni"/>
@@ -127,17 +105,6 @@
           <w:lang w:val="es-MX"/>
         </w:rPr>
       </w:pPr>
-    </w:p>
-    <w:p>
-      <w:pPr>
-        <w:jc w:val="both"/>
-        <w:rPr>
-          <w:rFonts w:ascii="Amasis MT Pro Black" w:hAnsi="Amasis MT Pro Black" w:cs="Aharoni"/>
-          <w:sz w:val="48"/>
-          <w:szCs w:val="48"/>
-          <w:lang w:val="es-MX"/>
-        </w:rPr>
-      </w:pPr>
       <w:r>
         <w:rPr>
           <w:rFonts w:ascii="Amasis MT Pro Black" w:hAnsi="Amasis MT Pro Black" w:cs="Aharoni"/>
@@ -169,17 +136,6 @@
           <w:lang w:val="es-MX"/>
         </w:rPr>
       </w:pPr>
-    </w:p>
-    <w:p>
-      <w:pPr>
-        <w:jc w:val="both"/>
-        <w:rPr>
-          <w:rFonts w:ascii="Amasis MT Pro Black" w:hAnsi="Amasis MT Pro Black" w:cs="Aharoni"/>
-          <w:sz w:val="48"/>
-          <w:szCs w:val="48"/>
-          <w:lang w:val="es-MX"/>
-        </w:rPr>
-      </w:pPr>
       <w:r>
         <w:rPr>
           <w:rFonts w:ascii="Amasis MT Pro Black" w:hAnsi="Amasis MT Pro Black" w:cs="Aharoni"/>
@@ -189,17 +145,6 @@
         </w:rPr>
         <w:t>1/7/2026</w:t>
       </w:r>
-    </w:p>
-    <w:p>
-      <w:pPr>
-        <w:jc w:val="both"/>
-        <w:rPr>
-          <w:rFonts w:ascii="Amasis MT Pro Black" w:hAnsi="Amasis MT Pro Black" w:cs="Aharoni"/>
-          <w:sz w:val="48"/>
-          <w:szCs w:val="48"/>
-          <w:lang w:val="es-MX"/>
-        </w:rPr>
-      </w:pPr>
     </w:p>
     <w:p>
       <w:pPr>
@@ -231,6 +176,107 @@
     </w:p>
     <w:p>
       <w:pPr>
+        <w:spacing w:after="0" w:line="240" w:lineRule="auto"/>
+        <w:jc w:val="both"/>
+        <w:rPr>
+          <w:rFonts w:ascii="Amasis MT Pro Black" w:eastAsia="Times New Roman" w:hAnsi="Amasis MT Pro Black" w:cs="Aharoni"/>
+          <w:color w:val="4A2E26"/>
+          <w:kern w:val="0"/>
+          <w:sz w:val="48"/>
+          <w:szCs w:val="48"/>
+          <w:lang w:eastAsia="es-DO"/>
+          <w14:ligatures w14:val="none"/>
+        </w:rPr>
+      </w:pPr>
+    </w:p>
+    <w:p>
+      <w:pPr>
+        <w:spacing w:after="0" w:line="240" w:lineRule="auto"/>
+        <w:jc w:val="both"/>
+        <w:rPr>
+          <w:rFonts w:ascii="Amasis MT Pro Black" w:eastAsia="Times New Roman" w:hAnsi="Amasis MT Pro Black" w:cs="Aharoni"/>
+          <w:color w:val="4A2E26"/>
+          <w:kern w:val="0"/>
+          <w:sz w:val="48"/>
+          <w:szCs w:val="48"/>
+          <w:lang w:eastAsia="es-DO"/>
+          <w14:ligatures w14:val="none"/>
+        </w:rPr>
+      </w:pPr>
+    </w:p>
+    <w:p>
+      <w:pPr>
+        <w:spacing w:after="0" w:line="240" w:lineRule="auto"/>
+        <w:jc w:val="both"/>
+        <w:rPr>
+          <w:rFonts w:ascii="Amasis MT Pro Black" w:eastAsia="Times New Roman" w:hAnsi="Amasis MT Pro Black" w:cs="Aharoni"/>
+          <w:color w:val="4A2E26"/>
+          <w:kern w:val="0"/>
+          <w:sz w:val="48"/>
+          <w:szCs w:val="48"/>
+          <w:lang w:eastAsia="es-DO"/>
+          <w14:ligatures w14:val="none"/>
+        </w:rPr>
+      </w:pPr>
+    </w:p>
+    <w:p>
+      <w:pPr>
+        <w:jc w:val="both"/>
+        <w:rPr>
+          <w:rFonts w:ascii="Segoe UI Emoji" w:eastAsia="Times New Roman" w:hAnsi="Segoe UI Emoji" w:cs="Segoe UI Emoji"/>
+          <w:color w:val="4A2E26"/>
+          <w:kern w:val="0"/>
+          <w:sz w:val="48"/>
+          <w:szCs w:val="48"/>
+          <w:lang w:eastAsia="es-DO"/>
+          <w14:ligatures w14:val="none"/>
+        </w:rPr>
+      </w:pPr>
+      <w:hyperlink r:id="rId7" w:history="1">
+        <w:r>
+          <w:rPr>
+            <w:rStyle w:val="Hyperlink"/>
+            <w:rFonts w:ascii="Segoe UI Emoji" w:eastAsia="Times New Roman" w:hAnsi="Segoe UI Emoji" w:cs="Segoe UI Emoji"/>
+            <w:kern w:val="0"/>
+            <w:sz w:val="48"/>
+            <w:szCs w:val="48"/>
+            <w:lang w:eastAsia="es-DO"/>
+            <w14:ligatures w14:val="none"/>
+          </w:rPr>
+          <w:t>https://github.com/EduardOO1515/ClinicaMedica</w:t>
+        </w:r>
+      </w:hyperlink>
+    </w:p>
+    <w:p>
+      <w:pPr>
+        <w:jc w:val="both"/>
+        <w:rPr>
+          <w:rFonts w:ascii="Segoe UI Emoji" w:eastAsia="Times New Roman" w:hAnsi="Segoe UI Emoji" w:cs="Segoe UI Emoji"/>
+          <w:color w:val="4A2E26"/>
+          <w:kern w:val="0"/>
+          <w:sz w:val="48"/>
+          <w:szCs w:val="48"/>
+          <w:lang w:eastAsia="es-DO"/>
+          <w14:ligatures w14:val="none"/>
+        </w:rPr>
+      </w:pPr>
+    </w:p>
+    <w:p>
+      <w:pPr>
+        <w:jc w:val="both"/>
+        <w:rPr>
+          <w:rFonts w:ascii="Segoe UI Emoji" w:eastAsia="Times New Roman" w:hAnsi="Segoe UI Emoji" w:cs="Segoe UI Emoji"/>
+          <w:color w:val="4A2E26"/>
+          <w:kern w:val="0"/>
+          <w:sz w:val="48"/>
+          <w:szCs w:val="48"/>
+          <w:lang w:eastAsia="es-DO"/>
+          <w14:ligatures w14:val="none"/>
+        </w:rPr>
+      </w:pPr>
+    </w:p>
+    <w:p>
+      <w:pPr>
         <w:jc w:val="both"/>
         <w:rPr>
           <w:rFonts w:ascii="Amasis MT Pro Black" w:hAnsi="Amasis MT Pro Black" w:cs="Aharoni"/>
@@ -258,7 +304,6 @@
           <w:szCs w:val="48"/>
           <w:lang w:val="es-MX"/>
         </w:rPr>
-        <w:lastRenderedPageBreak/>
         <w:drawing>
           <wp:anchor distT="0" distB="0" distL="114300" distR="114300" simplePos="0" relativeHeight="251645440" behindDoc="0" locked="0" layoutInCell="1" allowOverlap="1" wp14:anchorId="2759B348" wp14:editId="7812BA95">
             <wp:simplePos x="0" y="0"/>
@@ -283,7 +328,7 @@
                     <pic:cNvPicPr/>
                   </pic:nvPicPr>
                   <pic:blipFill>
-                    <a:blip r:embed="rId7">
+                    <a:blip r:embed="rId8">
                       <a:extLst>
                         <a:ext uri="{28A0092B-C50C-407E-A947-70E740481C1C}">
                           <a14:useLocalDpi xmlns:a14="http://schemas.microsoft.com/office/drawing/2010/main" val="0"/>
@@ -510,7 +555,6 @@
           <w:szCs w:val="48"/>
           <w:lang w:val="es-MX"/>
         </w:rPr>
-        <w:lastRenderedPageBreak/>
         <w:drawing>
           <wp:anchor distT="0" distB="0" distL="114300" distR="114300" simplePos="0" relativeHeight="251644416" behindDoc="0" locked="0" layoutInCell="1" allowOverlap="1" wp14:anchorId="3CD48510" wp14:editId="60032287">
             <wp:simplePos x="0" y="0"/>
@@ -535,7 +579,7 @@
                     <pic:cNvPicPr/>
                   </pic:nvPicPr>
                   <pic:blipFill>
-                    <a:blip r:embed="rId8">
+                    <a:blip r:embed="rId9">
                       <a:extLst>
                         <a:ext uri="{28A0092B-C50C-407E-A947-70E740481C1C}">
                           <a14:useLocalDpi xmlns:a14="http://schemas.microsoft.com/office/drawing/2010/main" val="0"/>
@@ -626,7 +670,7 @@
                     <pic:cNvPicPr/>
                   </pic:nvPicPr>
                   <pic:blipFill>
-                    <a:blip r:embed="rId9">
+                    <a:blip r:embed="rId10">
                       <a:extLst>
                         <a:ext uri="{28A0092B-C50C-407E-A947-70E740481C1C}">
                           <a14:useLocalDpi xmlns:a14="http://schemas.microsoft.com/office/drawing/2010/main" val="0"/>
@@ -809,11 +853,11 @@
       <w:r>
         <w:rPr>
           <w:rFonts w:ascii="Amasis MT Pro Black" w:hAnsi="Amasis MT Pro Black" w:cs="Aharoni"/>
-          <w:sz w:val="48"/>
-          <w:szCs w:val="48"/>
-          <w:lang w:val="es-MX"/>
-        </w:rPr>
-        <w:lastRenderedPageBreak/>
+          <w:noProof/>
+          <w:sz w:val="48"/>
+          <w:szCs w:val="48"/>
+          <w:lang w:val="es-MX"/>
+        </w:rPr>
         <w:drawing>
           <wp:anchor distT="0" distB="0" distL="114300" distR="114300" simplePos="0" relativeHeight="251649536" behindDoc="0" locked="0" layoutInCell="1" allowOverlap="1" wp14:anchorId="52A15280" wp14:editId="60BE9748">
             <wp:simplePos x="0" y="0"/>
@@ -838,7 +882,7 @@
                     <pic:cNvPicPr/>
                   </pic:nvPicPr>
                   <pic:blipFill>
-                    <a:blip r:embed="rId10">
+                    <a:blip r:embed="rId11">
                       <a:extLst>
                         <a:ext uri="{28A0092B-C50C-407E-A947-70E740481C1C}">
                           <a14:useLocalDpi xmlns:a14="http://schemas.microsoft.com/office/drawing/2010/main" val="0"/>
@@ -902,7 +946,7 @@
                     <pic:cNvPicPr/>
                   </pic:nvPicPr>
                   <pic:blipFill>
-                    <a:blip r:embed="rId11">
+                    <a:blip r:embed="rId12">
                       <a:extLst>
                         <a:ext uri="{28A0092B-C50C-407E-A947-70E740481C1C}">
                           <a14:useLocalDpi xmlns:a14="http://schemas.microsoft.com/office/drawing/2010/main" val="0"/>
@@ -1023,12 +1067,13 @@
       <w:r>
         <w:rPr>
           <w:rFonts w:ascii="Amasis MT Pro Black" w:hAnsi="Amasis MT Pro Black" w:cs="Aharoni"/>
+          <w:noProof/>
           <w:sz w:val="48"/>
           <w:szCs w:val="48"/>
           <w:lang w:val="es-MX"/>
         </w:rPr>
         <w:drawing>
-          <wp:anchor distT="0" distB="0" distL="114300" distR="114300" simplePos="0" relativeHeight="251653632" behindDoc="0" locked="0" layoutInCell="1" allowOverlap="1" wp14:anchorId="131FCED5" wp14:editId="6FF2DA92">
+          <wp:anchor distT="0" distB="0" distL="114300" distR="114300" simplePos="0" relativeHeight="251653632" behindDoc="0" locked="0" layoutInCell="1" allowOverlap="1" wp14:anchorId="131FCED5" wp14:editId="77D5D698">
             <wp:simplePos x="0" y="0"/>
             <wp:positionH relativeFrom="margin">
               <wp:align>center</wp:align>
@@ -1051,7 +1096,7 @@
                     <pic:cNvPicPr/>
                   </pic:nvPicPr>
                   <pic:blipFill>
-                    <a:blip r:embed="rId12" cstate="print">
+                    <a:blip r:embed="rId13" cstate="print">
                       <a:extLst>
                         <a:ext uri="{28A0092B-C50C-407E-A947-70E740481C1C}">
                           <a14:useLocalDpi xmlns:a14="http://schemas.microsoft.com/office/drawing/2010/main" val="0"/>
@@ -1185,13 +1230,13 @@
       <w:r>
         <w:rPr>
           <w:rFonts w:ascii="Amasis MT Pro Black" w:hAnsi="Amasis MT Pro Black" w:cs="Aharoni"/>
-          <w:sz w:val="48"/>
-          <w:szCs w:val="48"/>
-          <w:lang w:val="es-MX"/>
-        </w:rPr>
-        <w:lastRenderedPageBreak/>
+          <w:noProof/>
+          <w:sz w:val="48"/>
+          <w:szCs w:val="48"/>
+          <w:lang w:val="es-MX"/>
+        </w:rPr>
         <w:drawing>
-          <wp:anchor distT="0" distB="0" distL="114300" distR="114300" simplePos="0" relativeHeight="251659776" behindDoc="0" locked="0" layoutInCell="1" allowOverlap="1" wp14:anchorId="3B027ED6" wp14:editId="7D52E39C">
+          <wp:anchor distT="0" distB="0" distL="114300" distR="114300" simplePos="0" relativeHeight="251659776" behindDoc="0" locked="0" layoutInCell="1" allowOverlap="1" wp14:anchorId="3B027ED6" wp14:editId="0F4F7F5D">
             <wp:simplePos x="0" y="0"/>
             <wp:positionH relativeFrom="margin">
               <wp:align>center</wp:align>
@@ -1214,7 +1259,7 @@
                     <pic:cNvPicPr/>
                   </pic:nvPicPr>
                   <pic:blipFill>
-                    <a:blip r:embed="rId13" cstate="print">
+                    <a:blip r:embed="rId14" cstate="print">
                       <a:extLst>
                         <a:ext uri="{28A0092B-C50C-407E-A947-70E740481C1C}">
                           <a14:useLocalDpi xmlns:a14="http://schemas.microsoft.com/office/drawing/2010/main" val="0"/>
@@ -1326,12 +1371,13 @@
       <w:r>
         <w:rPr>
           <w:rFonts w:ascii="Amasis MT Pro Black" w:hAnsi="Amasis MT Pro Black" w:cs="Aharoni"/>
+          <w:noProof/>
           <w:sz w:val="48"/>
           <w:szCs w:val="48"/>
           <w:lang w:val="es-MX"/>
         </w:rPr>
         <w:drawing>
-          <wp:anchor distT="0" distB="0" distL="114300" distR="114300" simplePos="0" relativeHeight="251665920" behindDoc="0" locked="0" layoutInCell="1" allowOverlap="1" wp14:anchorId="39CD308E" wp14:editId="70EADDFB">
+          <wp:anchor distT="0" distB="0" distL="114300" distR="114300" simplePos="0" relativeHeight="251665920" behindDoc="0" locked="0" layoutInCell="1" allowOverlap="1" wp14:anchorId="39CD308E" wp14:editId="5023FA8B">
             <wp:simplePos x="0" y="0"/>
             <wp:positionH relativeFrom="margin">
               <wp:align>center</wp:align>
@@ -1354,7 +1400,7 @@
                     <pic:cNvPicPr/>
                   </pic:nvPicPr>
                   <pic:blipFill>
-                    <a:blip r:embed="rId14" cstate="print">
+                    <a:blip r:embed="rId15" cstate="print">
                       <a:extLst>
                         <a:ext uri="{28A0092B-C50C-407E-A947-70E740481C1C}">
                           <a14:useLocalDpi xmlns:a14="http://schemas.microsoft.com/office/drawing/2010/main" val="0"/>
@@ -1499,13 +1545,13 @@
       <w:r>
         <w:rPr>
           <w:rFonts w:ascii="Amasis MT Pro Black" w:hAnsi="Amasis MT Pro Black" w:cs="Aharoni"/>
-          <w:sz w:val="48"/>
-          <w:szCs w:val="48"/>
-          <w:lang w:val="es-MX"/>
-        </w:rPr>
-        <w:lastRenderedPageBreak/>
+          <w:noProof/>
+          <w:sz w:val="48"/>
+          <w:szCs w:val="48"/>
+          <w:lang w:val="es-MX"/>
+        </w:rPr>
         <w:drawing>
-          <wp:anchor distT="0" distB="0" distL="114300" distR="114300" simplePos="0" relativeHeight="251668992" behindDoc="0" locked="0" layoutInCell="1" allowOverlap="1" wp14:anchorId="531EEB3E" wp14:editId="5E5EAB9F">
+          <wp:anchor distT="0" distB="0" distL="114300" distR="114300" simplePos="0" relativeHeight="251668992" behindDoc="0" locked="0" layoutInCell="1" allowOverlap="1" wp14:anchorId="531EEB3E" wp14:editId="104C09E3">
             <wp:simplePos x="0" y="0"/>
             <wp:positionH relativeFrom="margin">
               <wp:align>center</wp:align>
@@ -1528,7 +1574,7 @@
                     <pic:cNvPicPr/>
                   </pic:nvPicPr>
                   <pic:blipFill>
-                    <a:blip r:embed="rId15" cstate="print">
+                    <a:blip r:embed="rId16" cstate="print">
                       <a:extLst>
                         <a:ext uri="{28A0092B-C50C-407E-A947-70E740481C1C}">
                           <a14:useLocalDpi xmlns:a14="http://schemas.microsoft.com/office/drawing/2010/main" val="0"/>
@@ -1754,11 +1800,11 @@
       <w:r>
         <w:rPr>
           <w:rFonts w:ascii="Amasis MT Pro Black" w:hAnsi="Amasis MT Pro Black" w:cs="Aharoni"/>
-          <w:sz w:val="48"/>
-          <w:szCs w:val="48"/>
-          <w:lang w:val="es-MX"/>
-        </w:rPr>
-        <w:lastRenderedPageBreak/>
+          <w:noProof/>
+          <w:sz w:val="48"/>
+          <w:szCs w:val="48"/>
+          <w:lang w:val="es-MX"/>
+        </w:rPr>
         <w:drawing>
           <wp:anchor distT="0" distB="0" distL="114300" distR="114300" simplePos="0" relativeHeight="251671040" behindDoc="0" locked="0" layoutInCell="1" allowOverlap="1" wp14:anchorId="35DE7AF8" wp14:editId="75BD3327">
             <wp:simplePos x="0" y="0"/>
@@ -1783,7 +1829,7 @@
                     <pic:cNvPicPr/>
                   </pic:nvPicPr>
                   <pic:blipFill>
-                    <a:blip r:embed="rId16">
+                    <a:blip r:embed="rId17">
                       <a:extLst>
                         <a:ext uri="{28A0092B-C50C-407E-A947-70E740481C1C}">
                           <a14:useLocalDpi xmlns:a14="http://schemas.microsoft.com/office/drawing/2010/main" val="0"/>
@@ -2014,30 +2060,24 @@
         <w:rPr>
           <w:rFonts w:asciiTheme="majorHAnsi" w:hAnsiTheme="majorHAnsi" w:cs="Aharoni"/>
         </w:rPr>
-        <w:t xml:space="preserve">La clase Persona es abstracta porque en una clínica nadie es solo una </w:t>
+        <w:t>La clase Persona es abstracta porque en una clínica nadie es solo una persona</w:t>
       </w:r>
       <w:r>
         <w:rPr>
           <w:rFonts w:asciiTheme="majorHAnsi" w:hAnsiTheme="majorHAnsi" w:cs="Aharoni"/>
         </w:rPr>
-        <w:t>persona</w:t>
+        <w:t xml:space="preserve">, </w:t>
       </w:r>
       <w:r>
         <w:rPr>
           <w:rFonts w:asciiTheme="majorHAnsi" w:hAnsiTheme="majorHAnsi" w:cs="Aharoni"/>
         </w:rPr>
-        <w:t xml:space="preserve">, </w:t>
+        <w:t>siempre es un Paciente o un Doctor. Sirve como molde base para evitar repetir código común como cédula, nombre y teléfono. De ella heredan las clases concretas Paciente y Doctor</w:t>
       </w:r>
       <w:r>
         <w:rPr>
           <w:rFonts w:asciiTheme="majorHAnsi" w:hAnsiTheme="majorHAnsi" w:cs="Aharoni"/>
         </w:rPr>
-        <w:t>siempre es un Paciente o un Doctor. Sirve como molde base para evitar repetir código común como cédula, nombre y teléfono. De ella heredan las clases concretas Paciente y Doctor</w:t>
-      </w:r>
-      <w:r>
-        <w:rPr>
-          <w:rFonts w:asciiTheme="majorHAnsi" w:hAnsiTheme="majorHAnsi" w:cs="Aharoni"/>
-        </w:rPr>
         <w:t>.</w:t>
       </w:r>
     </w:p>
@@ -2079,6 +2119,7 @@
           <w:bCs/>
           <w:i/>
           <w:iCs/>
+          <w:noProof/>
           <w:sz w:val="28"/>
           <w:szCs w:val="28"/>
           <w:u w:val="single"/>
@@ -2108,7 +2149,7 @@
                     <pic:cNvPicPr/>
                   </pic:nvPicPr>
                   <pic:blipFill>
-                    <a:blip r:embed="rId17">
+                    <a:blip r:embed="rId18">
                       <a:extLst>
                         <a:ext uri="{28A0092B-C50C-407E-A947-70E740481C1C}">
                           <a14:useLocalDpi xmlns:a14="http://schemas.microsoft.com/office/drawing/2010/main" val="0"/>
@@ -2277,6 +2318,7 @@
           <w:bCs/>
           <w:i/>
           <w:iCs/>
+          <w:noProof/>
           <w:sz w:val="28"/>
           <w:szCs w:val="28"/>
           <w:u w:val="single"/>
@@ -2299,7 +2341,7 @@
                     <pic:cNvPicPr/>
                   </pic:nvPicPr>
                   <pic:blipFill>
-                    <a:blip r:embed="rId18"/>
+                    <a:blip r:embed="rId19"/>
                     <a:stretch>
                       <a:fillRect/>
                     </a:stretch>
@@ -2374,63 +2416,48 @@
           <w:sz w:val="28"/>
           <w:szCs w:val="28"/>
         </w:rPr>
-        <w:t xml:space="preserve">) es virtual porque tiene una base en </w:t>
-      </w:r>
-      <w:r>
-        <w:rPr>
-          <w:rFonts w:cs="Aharoni"/>
-          <w:sz w:val="28"/>
-          <w:szCs w:val="28"/>
-        </w:rPr>
-        <w:t>Persona,</w:t>
-      </w:r>
-      <w:r>
-        <w:rPr>
-          <w:rFonts w:cs="Aharoni"/>
-          <w:sz w:val="28"/>
-          <w:szCs w:val="28"/>
-        </w:rPr>
-        <w:t xml:space="preserve"> pero cada clase hija lo sobreescribe con información adicional. Paciente muestra si tiene seguro, Doctor muestra su especialidad. El mismo método produce resultados diferentes según el objeto.</w:t>
-      </w:r>
-    </w:p>
-    <w:p>
-      <w:pPr>
-        <w:jc w:val="both"/>
-        <w:rPr>
-          <w:rFonts w:ascii="Amasis MT Pro Black" w:hAnsi="Amasis MT Pro Black" w:cs="Aharoni"/>
-          <w:b/>
-          <w:bCs/>
-          <w:i/>
-          <w:iCs/>
-          <w:sz w:val="28"/>
-          <w:szCs w:val="28"/>
-          <w:u w:val="single"/>
-          <w:lang w:val="es-MX"/>
-        </w:rPr>
-      </w:pPr>
-    </w:p>
-    <w:p>
-      <w:pPr>
-        <w:jc w:val="both"/>
-        <w:rPr>
-          <w:rFonts w:ascii="Amasis MT Pro Black" w:hAnsi="Amasis MT Pro Black" w:cs="Aharoni"/>
-          <w:b/>
-          <w:bCs/>
-          <w:i/>
-          <w:iCs/>
-          <w:sz w:val="28"/>
-          <w:szCs w:val="28"/>
-          <w:u w:val="single"/>
-          <w:lang w:val="es-MX"/>
-        </w:rPr>
-      </w:pPr>
-      <w:r>
-        <w:rPr>
-          <w:rFonts w:ascii="Amasis MT Pro Black" w:hAnsi="Amasis MT Pro Black" w:cs="Aharoni"/>
-          <w:b/>
-          <w:bCs/>
-          <w:i/>
-          <w:iCs/>
+        <w:t>) es virtual porque tiene una base en Persona, pero cada clase hija lo sobreescribe con información adicional. Paciente muestra si tiene seguro, Doctor muestra su especialidad. El mismo método produce resultados diferentes según el objeto.</w:t>
+      </w:r>
+    </w:p>
+    <w:p>
+      <w:pPr>
+        <w:jc w:val="both"/>
+        <w:rPr>
+          <w:rFonts w:ascii="Amasis MT Pro Black" w:hAnsi="Amasis MT Pro Black" w:cs="Aharoni"/>
+          <w:b/>
+          <w:bCs/>
+          <w:i/>
+          <w:iCs/>
+          <w:sz w:val="28"/>
+          <w:szCs w:val="28"/>
+          <w:u w:val="single"/>
+          <w:lang w:val="es-MX"/>
+        </w:rPr>
+      </w:pPr>
+    </w:p>
+    <w:p>
+      <w:pPr>
+        <w:jc w:val="both"/>
+        <w:rPr>
+          <w:rFonts w:ascii="Amasis MT Pro Black" w:hAnsi="Amasis MT Pro Black" w:cs="Aharoni"/>
+          <w:b/>
+          <w:bCs/>
+          <w:i/>
+          <w:iCs/>
+          <w:sz w:val="28"/>
+          <w:szCs w:val="28"/>
+          <w:u w:val="single"/>
+          <w:lang w:val="es-MX"/>
+        </w:rPr>
+      </w:pPr>
+      <w:r>
+        <w:rPr>
+          <w:rFonts w:ascii="Amasis MT Pro Black" w:hAnsi="Amasis MT Pro Black" w:cs="Aharoni"/>
+          <w:b/>
+          <w:bCs/>
+          <w:i/>
+          <w:iCs/>
+          <w:noProof/>
           <w:sz w:val="28"/>
           <w:szCs w:val="28"/>
           <w:u w:val="single"/>
@@ -2452,7 +2479,7 @@
                     <pic:cNvPicPr/>
                   </pic:nvPicPr>
                   <pic:blipFill>
-                    <a:blip r:embed="rId19"/>
+                    <a:blip r:embed="rId20"/>
                     <a:stretch>
                       <a:fillRect/>
                     </a:stretch>
@@ -2593,6 +2620,7 @@
           <w:bCs/>
           <w:i/>
           <w:iCs/>
+          <w:noProof/>
           <w:sz w:val="28"/>
           <w:szCs w:val="28"/>
           <w:u w:val="single"/>
@@ -2615,7 +2643,7 @@
                     <pic:cNvPicPr/>
                   </pic:nvPicPr>
                   <pic:blipFill>
-                    <a:blip r:embed="rId20"/>
+                    <a:blip r:embed="rId21"/>
                     <a:stretch>
                       <a:fillRect/>
                     </a:stretch>
@@ -2722,6 +2750,7 @@
           <w:bCs/>
           <w:i/>
           <w:iCs/>
+          <w:noProof/>
           <w:sz w:val="28"/>
           <w:szCs w:val="28"/>
           <w:u w:val="single"/>
@@ -2743,7 +2772,7 @@
                     <pic:cNvPicPr/>
                   </pic:nvPicPr>
                   <pic:blipFill>
-                    <a:blip r:embed="rId21"/>
+                    <a:blip r:embed="rId22"/>
                     <a:stretch>
                       <a:fillRect/>
                     </a:stretch>
@@ -2852,6 +2881,7 @@
           <w:bCs/>
           <w:i/>
           <w:iCs/>
+          <w:noProof/>
           <w:sz w:val="28"/>
           <w:szCs w:val="28"/>
           <w:u w:val="single"/>
@@ -2873,7 +2903,7 @@
                     <pic:cNvPicPr/>
                   </pic:nvPicPr>
                   <pic:blipFill>
-                    <a:blip r:embed="rId22"/>
+                    <a:blip r:embed="rId23"/>
                     <a:stretch>
                       <a:fillRect/>
                     </a:stretch>
@@ -2986,6 +3016,7 @@
           <w:bCs/>
           <w:i/>
           <w:iCs/>
+          <w:noProof/>
           <w:sz w:val="28"/>
           <w:szCs w:val="28"/>
           <w:u w:val="single"/>
@@ -3008,7 +3039,7 @@
                     <pic:cNvPicPr/>
                   </pic:nvPicPr>
                   <pic:blipFill>
-                    <a:blip r:embed="rId23"/>
+                    <a:blip r:embed="rId24"/>
                     <a:stretch>
                       <a:fillRect/>
                     </a:stretch>
@@ -3035,6 +3066,7 @@
           <w:bCs/>
           <w:i/>
           <w:iCs/>
+          <w:noProof/>
           <w:sz w:val="28"/>
           <w:szCs w:val="28"/>
           <w:u w:val="single"/>
@@ -3056,7 +3088,7 @@
                     <pic:cNvPicPr/>
                   </pic:nvPicPr>
                   <pic:blipFill>
-                    <a:blip r:embed="rId24"/>
+                    <a:blip r:embed="rId25"/>
                     <a:stretch>
                       <a:fillRect/>
                     </a:stretch>
@@ -3292,19 +3324,7 @@
         <w:rPr>
           <w:rFonts w:cs="Aharoni"/>
         </w:rPr>
-        <w:t xml:space="preserve">Este proyecto me enseñó que programar es como construir una </w:t>
-      </w:r>
-      <w:r>
-        <w:rPr>
-          <w:rFonts w:cs="Aharoni"/>
-        </w:rPr>
-        <w:t>casa necesitas</w:t>
-      </w:r>
-      <w:r>
-        <w:rPr>
-          <w:rFonts w:cs="Aharoni"/>
-        </w:rPr>
-        <w:t xml:space="preserve"> una buena base para que todo lo demás funcione. Me siento orgulloso del resultado y con ganas de seguir aprendiendo.</w:t>
+        <w:t>Este proyecto me enseñó que programar es como construir una casa necesitas una buena base para que todo lo demás funcione. Me siento orgulloso del resultado y con ganas de seguir aprendiendo.</w:t>
       </w:r>
     </w:p>
     <w:p>
@@ -3939,6 +3959,7 @@
   <w:style w:type="character" w:default="1" w:styleId="DefaultParagraphFont">
     <w:name w:val="Default Paragraph Font"/>
     <w:uiPriority w:val="1"/>
+    <w:semiHidden/>
     <w:unhideWhenUsed/>
   </w:style>
   <w:style w:type="table" w:default="1" w:styleId="TableNormal">
@@ -4256,6 +4277,29 @@
     <w:name w:val="textoresumido1"/>
     <w:basedOn w:val="DefaultParagraphFont"/>
     <w:rsid w:val="007C081B"/>
+  </w:style>
+  <w:style w:type="character" w:styleId="Hyperlink">
+    <w:name w:val="Hyperlink"/>
+    <w:basedOn w:val="DefaultParagraphFont"/>
+    <w:uiPriority w:val="99"/>
+    <w:unhideWhenUsed/>
+    <w:rsid w:val="00AF6296"/>
+    <w:rPr>
+      <w:color w:val="467886" w:themeColor="hyperlink"/>
+      <w:u w:val="single"/>
+    </w:rPr>
+  </w:style>
+  <w:style w:type="character" w:styleId="UnresolvedMention">
+    <w:name w:val="Unresolved Mention"/>
+    <w:basedOn w:val="DefaultParagraphFont"/>
+    <w:uiPriority w:val="99"/>
+    <w:semiHidden/>
+    <w:unhideWhenUsed/>
+    <w:rsid w:val="00AF6296"/>
+    <w:rPr>
+      <w:color w:val="605E5C"/>
+      <w:shd w:val="clear" w:color="auto" w:fill="E1DFDD"/>
+    </w:rPr>
   </w:style>
 </w:styles>
 </file>
@@ -4584,15 +4628,6 @@
 </file>
 
 <file path=customXml/item2.xml><?xml version="1.0" encoding="utf-8"?>
-<?mso-contentType ?>
-<FormTemplates xmlns="http://schemas.microsoft.com/sharepoint/v3/contenttype/forms">
-  <Display>DocumentLibraryForm</Display>
-  <Edit>DocumentLibraryForm</Edit>
-  <New>DocumentLibraryForm</New>
-</FormTemplates>
-</file>
-
-<file path=customXml/item3.xml><?xml version="1.0" encoding="utf-8"?>
 <ct:contentTypeSchema xmlns:ct="http://schemas.microsoft.com/office/2006/metadata/contentType" xmlns:ma="http://schemas.microsoft.com/office/2006/metadata/properties/metaAttributes" ct:_="" ma:_="" ma:contentTypeName="Documento" ma:contentTypeID="0x010100CE5E3EDC7E652349A4379C07093F1928" ma:contentTypeVersion="14" ma:contentTypeDescription="Crear nuevo documento." ma:contentTypeScope="" ma:versionID="38c8771002e582c4853966174245a455">
   <xsd:schema xmlns:xsd="http://www.w3.org/2001/XMLSchema" xmlns:xs="http://www.w3.org/2001/XMLSchema" xmlns:p="http://schemas.microsoft.com/office/2006/metadata/properties" xmlns:ns3="f24ef306-be3d-4141-a3cb-cd8da1e156ab" xmlns:ns4="88afbfcb-80fb-47df-9185-8d1745b67cee" targetNamespace="http://schemas.microsoft.com/office/2006/metadata/properties" ma:root="true" ma:fieldsID="3448bc1cbbde122f9e75e1e4fbe4e6dd" ns3:_="" ns4:_="">
     <xsd:import namespace="f24ef306-be3d-4141-a3cb-cd8da1e156ab"/>
@@ -4819,6 +4854,15 @@
 </ct:contentTypeSchema>
 </file>
 
+<file path=customXml/item3.xml><?xml version="1.0" encoding="utf-8"?>
+<?mso-contentType ?>
+<FormTemplates xmlns="http://schemas.microsoft.com/sharepoint/v3/contenttype/forms">
+  <Display>DocumentLibraryForm</Display>
+  <Edit>DocumentLibraryForm</Edit>
+  <New>DocumentLibraryForm</New>
+</FormTemplates>
+</file>
+
 <file path=customXml/itemProps1.xml><?xml version="1.0" encoding="utf-8"?>
 <ds:datastoreItem xmlns:ds="http://schemas.openxmlformats.org/officeDocument/2006/customXml" ds:itemID="{4586036F-0252-452E-9BA4-32B6BB602EA2}">
   <ds:schemaRefs>
@@ -4830,14 +4874,6 @@
 </file>
 
 <file path=customXml/itemProps2.xml><?xml version="1.0" encoding="utf-8"?>
-<ds:datastoreItem xmlns:ds="http://schemas.openxmlformats.org/officeDocument/2006/customXml" ds:itemID="{11626284-90FF-4EFB-BDB9-341632DDF8DD}">
-  <ds:schemaRefs>
-    <ds:schemaRef ds:uri="http://schemas.microsoft.com/sharepoint/v3/contenttype/forms"/>
-  </ds:schemaRefs>
-</ds:datastoreItem>
-</file>
-
-<file path=customXml/itemProps3.xml><?xml version="1.0" encoding="utf-8"?>
 <ds:datastoreItem xmlns:ds="http://schemas.openxmlformats.org/officeDocument/2006/customXml" ds:itemID="{2582CF62-1335-4A58-BB31-C7A6AA38EEEF}">
   <ds:schemaRefs>
     <ds:schemaRef ds:uri="http://schemas.microsoft.com/office/2006/metadata/contentType"/>
@@ -4854,4 +4890,12 @@
     <ds:schemaRef ds:uri="http://schemas.microsoft.com/internal/obd"/>
   </ds:schemaRefs>
 </ds:datastoreItem>
+</file>
+
+<file path=customXml/itemProps3.xml><?xml version="1.0" encoding="utf-8"?>
+<ds:datastoreItem xmlns:ds="http://schemas.openxmlformats.org/officeDocument/2006/customXml" ds:itemID="{11626284-90FF-4EFB-BDB9-341632DDF8DD}">
+  <ds:schemaRefs>
+    <ds:schemaRef ds:uri="http://schemas.microsoft.com/sharepoint/v3/contenttype/forms"/>
+  </ds:schemaRefs>
+</ds:datastoreItem>
 </file>
</xml_diff>